<commit_message>
completed schematic and ordered gerbers
</commit_message>
<xml_diff>
--- a/docs/SystemDesignDocument.docx
+++ b/docs/SystemDesignDocument.docx
@@ -2135,7 +2135,21 @@
         <w:rPr>
           <w:rFonts w:cstheme="minorHAnsi"/>
         </w:rPr>
-        <w:t>Solving the output capacitance equation from the datasheet. Assume 30% inductor current ripple for a ballpark minimum. Set the voltage ripple to 100mV, Iout to 3A, and D to 56%. For worst case solve for a ∆I</w:t>
+        <w:t xml:space="preserve">Solving the output capacitance equation from the datasheet. Assume 30% inductor current ripple for a ballpark minimum. Set the voltage ripple to 100mV, </w:t>
+      </w:r>
+      <w:proofErr w:type="spellStart"/>
+      <w:r>
+        <w:rPr>
+          <w:rFonts w:cstheme="minorHAnsi"/>
+        </w:rPr>
+        <w:t>Iout</w:t>
+      </w:r>
+      <w:proofErr w:type="spellEnd"/>
+      <w:r>
+        <w:rPr>
+          <w:rFonts w:cstheme="minorHAnsi"/>
+        </w:rPr>
+        <w:t xml:space="preserve"> to 3A, and D to 56%. For worst case solve for a ∆I</w:t>
       </w:r>
       <w:r>
         <w:rPr>
@@ -2481,7 +2495,14 @@
         <w:rPr>
           <w:rFonts w:cstheme="minorHAnsi"/>
         </w:rPr>
-        <w:t>The datasheet does not give a formula for minimum C</w:t>
+        <w:t xml:space="preserve">The datasheet does not give a formula for minimum </w:t>
+      </w:r>
+      <w:proofErr w:type="gramStart"/>
+      <w:r>
+        <w:rPr>
+          <w:rFonts w:cstheme="minorHAnsi"/>
+        </w:rPr>
+        <w:t>C</w:t>
       </w:r>
       <w:r>
         <w:rPr>
@@ -2490,6 +2511,7 @@
         </w:rPr>
         <w:t>OUT</w:t>
       </w:r>
+      <w:proofErr w:type="gramEnd"/>
       <w:r>
         <w:rPr>
           <w:rFonts w:cstheme="minorHAnsi"/>
@@ -2500,12 +2522,40 @@
         <w:rPr>
           <w:rFonts w:cstheme="minorHAnsi"/>
         </w:rPr>
-        <w:t>. These capacitors have an effective capacitance of 7.1µF / ea when 13V is applied to them. The ten capacitor bank will have around 71µF of capacitance, more than the minimum specified 66</w:t>
-      </w:r>
+        <w:t xml:space="preserve">. These capacitors have an effective capacitance of 7.1µF / </w:t>
+      </w:r>
+      <w:proofErr w:type="spellStart"/>
       <w:r>
         <w:rPr>
           <w:rFonts w:cstheme="minorHAnsi"/>
         </w:rPr>
+        <w:t>ea</w:t>
+      </w:r>
+      <w:proofErr w:type="spellEnd"/>
+      <w:r>
+        <w:rPr>
+          <w:rFonts w:cstheme="minorHAnsi"/>
+        </w:rPr>
+        <w:t xml:space="preserve"> when 13V is applied to them. The </w:t>
+      </w:r>
+      <w:proofErr w:type="gramStart"/>
+      <w:r>
+        <w:rPr>
+          <w:rFonts w:cstheme="minorHAnsi"/>
+        </w:rPr>
+        <w:t>ten capacitor</w:t>
+      </w:r>
+      <w:proofErr w:type="gramEnd"/>
+      <w:r>
+        <w:rPr>
+          <w:rFonts w:cstheme="minorHAnsi"/>
+        </w:rPr>
+        <w:t xml:space="preserve"> bank will have around 71µF of capacitance, more than the minimum specified 66</w:t>
+      </w:r>
+      <w:r>
+        <w:rPr>
+          <w:rFonts w:cstheme="minorHAnsi"/>
+        </w:rPr>
         <w:t xml:space="preserve"> </w:t>
       </w:r>
       <w:r>
@@ -2534,7 +2584,13 @@
       </w:pPr>
       <w:r>
         <w:lastRenderedPageBreak/>
-        <w:t xml:space="preserve">Input Capacitance </w:t>
+        <w:t>Input Capacitance</w:t>
+      </w:r>
+      <w:r>
+        <w:t xml:space="preserve"> and EMI Filter</w:t>
+      </w:r>
+      <w:r>
+        <w:t xml:space="preserve"> </w:t>
       </w:r>
     </w:p>
     <w:p>
@@ -2617,11 +2673,464 @@
           <w:rFonts w:cstheme="minorHAnsi"/>
         </w:rPr>
       </w:pPr>
+      <w:r>
+        <w:rPr>
+          <w:rFonts w:cstheme="minorHAnsi"/>
+        </w:rPr>
+        <w:t xml:space="preserve">The following input EMI filter was designed: </w:t>
+      </w:r>
+    </w:p>
+    <w:p>
+      <w:pPr>
+        <w:pStyle w:val="NoSpacing"/>
+        <w:contextualSpacing/>
+        <w:rPr>
+          <w:rFonts w:cstheme="minorHAnsi"/>
+        </w:rPr>
+      </w:pPr>
     </w:p>
     <w:p>
       <w:pPr>
         <w:spacing w:after="0" w:line="240" w:lineRule="auto"/>
         <w:contextualSpacing/>
+        <w:jc w:val="center"/>
+        <w:rPr>
+          <w:rFonts w:cstheme="minorHAnsi"/>
+        </w:rPr>
+      </w:pPr>
+      <w:r>
+        <w:rPr>
+          <w:rFonts w:cstheme="minorHAnsi"/>
+          <w:noProof/>
+        </w:rPr>
+        <w:drawing>
+          <wp:inline distT="0" distB="0" distL="0" distR="0" wp14:anchorId="69ED6695" wp14:editId="1DA4FE33">
+            <wp:extent cx="4227226" cy="1385400"/>
+            <wp:effectExtent l="0" t="0" r="1905" b="5715"/>
+            <wp:docPr id="50911935" name="Picture 1" descr="A diagram of a circuit&#10;&#10;AI-generated content may be incorrect."/>
+            <wp:cNvGraphicFramePr>
+              <a:graphicFrameLocks xmlns:a="http://schemas.openxmlformats.org/drawingml/2006/main" noChangeAspect="1"/>
+            </wp:cNvGraphicFramePr>
+            <a:graphic xmlns:a="http://schemas.openxmlformats.org/drawingml/2006/main">
+              <a:graphicData uri="http://schemas.openxmlformats.org/drawingml/2006/picture">
+                <pic:pic xmlns:pic="http://schemas.openxmlformats.org/drawingml/2006/picture">
+                  <pic:nvPicPr>
+                    <pic:cNvPr id="50911935" name="Picture 1" descr="A diagram of a circuit&#10;&#10;AI-generated content may be incorrect."/>
+                    <pic:cNvPicPr/>
+                  </pic:nvPicPr>
+                  <pic:blipFill>
+                    <a:blip r:embed="rId24"/>
+                    <a:stretch>
+                      <a:fillRect/>
+                    </a:stretch>
+                  </pic:blipFill>
+                  <pic:spPr>
+                    <a:xfrm>
+                      <a:off x="0" y="0"/>
+                      <a:ext cx="4247405" cy="1392013"/>
+                    </a:xfrm>
+                    <a:prstGeom prst="rect">
+                      <a:avLst/>
+                    </a:prstGeom>
+                  </pic:spPr>
+                </pic:pic>
+              </a:graphicData>
+            </a:graphic>
+          </wp:inline>
+        </w:drawing>
+      </w:r>
+    </w:p>
+    <w:p>
+      <w:pPr>
+        <w:spacing w:after="0" w:line="240" w:lineRule="auto"/>
+        <w:contextualSpacing/>
+        <w:rPr>
+          <w:rFonts w:cstheme="minorHAnsi"/>
+        </w:rPr>
+      </w:pPr>
+    </w:p>
+    <w:p>
+      <w:pPr>
+        <w:spacing w:after="0" w:line="240" w:lineRule="auto"/>
+        <w:contextualSpacing/>
+        <w:rPr>
+          <w:rFonts w:cstheme="minorHAnsi"/>
+        </w:rPr>
+      </w:pPr>
+      <w:r>
+        <w:rPr>
+          <w:rFonts w:cstheme="minorHAnsi"/>
+        </w:rPr>
+        <w:t xml:space="preserve">Resistances were strategically placed and chosen with the help of LTspice to damp out any resonances between the high Q ceramic capacitors. </w:t>
+      </w:r>
+      <w:r>
+        <w:rPr>
+          <w:rFonts w:cstheme="minorHAnsi"/>
+        </w:rPr>
+        <w:t xml:space="preserve">Since a fuse was desired, it was placed in the filter so that its resistance which would typically be undesirable is used to help damp the LC network. </w:t>
+      </w:r>
+    </w:p>
+    <w:p>
+      <w:pPr>
+        <w:spacing w:after="0" w:line="240" w:lineRule="auto"/>
+        <w:contextualSpacing/>
+        <w:rPr>
+          <w:rFonts w:cstheme="minorHAnsi"/>
+        </w:rPr>
+      </w:pPr>
+    </w:p>
+    <w:p>
+      <w:pPr>
+        <w:spacing w:after="0" w:line="240" w:lineRule="auto"/>
+        <w:contextualSpacing/>
+        <w:rPr>
+          <w:rFonts w:cstheme="minorHAnsi"/>
+        </w:rPr>
+      </w:pPr>
+      <w:r>
+        <w:rPr>
+          <w:rFonts w:cstheme="minorHAnsi"/>
+        </w:rPr>
+        <w:t xml:space="preserve">The output impedance seen by the buck is as follows: </w:t>
+      </w:r>
+    </w:p>
+    <w:p>
+      <w:pPr>
+        <w:spacing w:after="0" w:line="240" w:lineRule="auto"/>
+        <w:contextualSpacing/>
+        <w:rPr>
+          <w:rFonts w:cstheme="minorHAnsi"/>
+        </w:rPr>
+      </w:pPr>
+    </w:p>
+    <w:p>
+      <w:pPr>
+        <w:spacing w:after="0" w:line="240" w:lineRule="auto"/>
+        <w:contextualSpacing/>
+        <w:jc w:val="center"/>
+        <w:rPr>
+          <w:rFonts w:cstheme="minorHAnsi"/>
+        </w:rPr>
+      </w:pPr>
+      <w:r>
+        <w:rPr>
+          <w:rFonts w:cstheme="minorHAnsi"/>
+          <w:noProof/>
+        </w:rPr>
+        <w:drawing>
+          <wp:inline distT="0" distB="0" distL="0" distR="0" wp14:anchorId="34D0B5FA" wp14:editId="79F97A55">
+            <wp:extent cx="4609475" cy="2800525"/>
+            <wp:effectExtent l="0" t="0" r="635" b="0"/>
+            <wp:docPr id="711489069" name="Picture 1"/>
+            <wp:cNvGraphicFramePr>
+              <a:graphicFrameLocks xmlns:a="http://schemas.openxmlformats.org/drawingml/2006/main" noChangeAspect="1"/>
+            </wp:cNvGraphicFramePr>
+            <a:graphic xmlns:a="http://schemas.openxmlformats.org/drawingml/2006/main">
+              <a:graphicData uri="http://schemas.openxmlformats.org/drawingml/2006/picture">
+                <pic:pic xmlns:pic="http://schemas.openxmlformats.org/drawingml/2006/picture">
+                  <pic:nvPicPr>
+                    <pic:cNvPr id="711489069" name="Picture 1"/>
+                    <pic:cNvPicPr/>
+                  </pic:nvPicPr>
+                  <pic:blipFill>
+                    <a:blip r:embed="rId25"/>
+                    <a:stretch>
+                      <a:fillRect/>
+                    </a:stretch>
+                  </pic:blipFill>
+                  <pic:spPr>
+                    <a:xfrm>
+                      <a:off x="0" y="0"/>
+                      <a:ext cx="4618271" cy="2805869"/>
+                    </a:xfrm>
+                    <a:prstGeom prst="rect">
+                      <a:avLst/>
+                    </a:prstGeom>
+                  </pic:spPr>
+                </pic:pic>
+              </a:graphicData>
+            </a:graphic>
+          </wp:inline>
+        </w:drawing>
+      </w:r>
+    </w:p>
+    <w:p>
+      <w:pPr>
+        <w:spacing w:after="0" w:line="240" w:lineRule="auto"/>
+        <w:contextualSpacing/>
+        <w:rPr>
+          <w:rFonts w:cstheme="minorHAnsi"/>
+        </w:rPr>
+      </w:pPr>
+    </w:p>
+    <w:p>
+      <w:pPr>
+        <w:spacing w:after="0" w:line="240" w:lineRule="auto"/>
+        <w:contextualSpacing/>
+        <w:rPr>
+          <w:rFonts w:cstheme="minorHAnsi"/>
+        </w:rPr>
+      </w:pPr>
+      <w:r>
+        <w:rPr>
+          <w:rFonts w:cstheme="minorHAnsi"/>
+        </w:rPr>
+        <w:t xml:space="preserve">The Y axis of the above graph is Ohms. </w:t>
+      </w:r>
+      <w:r>
+        <w:rPr>
+          <w:rFonts w:cstheme="minorHAnsi"/>
+        </w:rPr>
+        <w:t>Note the large spike at ~175 kHz is not ideal. However, since that spike is only ~0.125Ω and since it can easily be adjusted by changing the damping resistor it will be left and tested. If the buck is still stable, this filter will provide superior damping.</w:t>
+      </w:r>
+    </w:p>
+    <w:p>
+      <w:pPr>
+        <w:rPr>
+          <w:rFonts w:cstheme="minorHAnsi"/>
+        </w:rPr>
+      </w:pPr>
+      <w:r>
+        <w:rPr>
+          <w:rFonts w:cstheme="minorHAnsi"/>
+        </w:rPr>
+        <w:br w:type="page"/>
+      </w:r>
+    </w:p>
+    <w:p>
+      <w:pPr>
+        <w:spacing w:after="0" w:line="240" w:lineRule="auto"/>
+        <w:contextualSpacing/>
+        <w:rPr>
+          <w:rFonts w:cstheme="minorHAnsi"/>
+        </w:rPr>
+      </w:pPr>
+    </w:p>
+    <w:p>
+      <w:pPr>
+        <w:spacing w:after="0" w:line="240" w:lineRule="auto"/>
+        <w:contextualSpacing/>
+        <w:rPr>
+          <w:rFonts w:cstheme="minorHAnsi"/>
+        </w:rPr>
+      </w:pPr>
+      <w:r>
+        <w:rPr>
+          <w:rFonts w:cstheme="minorHAnsi"/>
+        </w:rPr>
+        <w:t xml:space="preserve">The input impedance </w:t>
+      </w:r>
+      <w:r>
+        <w:rPr>
+          <w:rFonts w:cstheme="minorHAnsi"/>
+        </w:rPr>
+        <w:t xml:space="preserve">seen by the power supply source is as follows: </w:t>
+      </w:r>
+    </w:p>
+    <w:p>
+      <w:pPr>
+        <w:spacing w:after="0" w:line="240" w:lineRule="auto"/>
+        <w:contextualSpacing/>
+        <w:rPr>
+          <w:rFonts w:cstheme="minorHAnsi"/>
+        </w:rPr>
+      </w:pPr>
+    </w:p>
+    <w:p>
+      <w:pPr>
+        <w:spacing w:after="0" w:line="240" w:lineRule="auto"/>
+        <w:contextualSpacing/>
+        <w:jc w:val="center"/>
+        <w:rPr>
+          <w:rFonts w:cstheme="minorHAnsi"/>
+        </w:rPr>
+      </w:pPr>
+      <w:r>
+        <w:rPr>
+          <w:rFonts w:cstheme="minorHAnsi"/>
+          <w:noProof/>
+        </w:rPr>
+        <w:drawing>
+          <wp:inline distT="0" distB="0" distL="0" distR="0" wp14:anchorId="0D9B13A7" wp14:editId="220FC045">
+            <wp:extent cx="4467879" cy="2705724"/>
+            <wp:effectExtent l="0" t="0" r="0" b="0"/>
+            <wp:docPr id="1158453208" name="Picture 1" descr="A graph with lines and dots&#10;&#10;AI-generated content may be incorrect."/>
+            <wp:cNvGraphicFramePr>
+              <a:graphicFrameLocks xmlns:a="http://schemas.openxmlformats.org/drawingml/2006/main" noChangeAspect="1"/>
+            </wp:cNvGraphicFramePr>
+            <a:graphic xmlns:a="http://schemas.openxmlformats.org/drawingml/2006/main">
+              <a:graphicData uri="http://schemas.openxmlformats.org/drawingml/2006/picture">
+                <pic:pic xmlns:pic="http://schemas.openxmlformats.org/drawingml/2006/picture">
+                  <pic:nvPicPr>
+                    <pic:cNvPr id="1158453208" name="Picture 1" descr="A graph with lines and dots&#10;&#10;AI-generated content may be incorrect."/>
+                    <pic:cNvPicPr/>
+                  </pic:nvPicPr>
+                  <pic:blipFill>
+                    <a:blip r:embed="rId26"/>
+                    <a:stretch>
+                      <a:fillRect/>
+                    </a:stretch>
+                  </pic:blipFill>
+                  <pic:spPr>
+                    <a:xfrm>
+                      <a:off x="0" y="0"/>
+                      <a:ext cx="4476748" cy="2711095"/>
+                    </a:xfrm>
+                    <a:prstGeom prst="rect">
+                      <a:avLst/>
+                    </a:prstGeom>
+                  </pic:spPr>
+                </pic:pic>
+              </a:graphicData>
+            </a:graphic>
+          </wp:inline>
+        </w:drawing>
+      </w:r>
+    </w:p>
+    <w:p>
+      <w:pPr>
+        <w:spacing w:after="0" w:line="240" w:lineRule="auto"/>
+        <w:contextualSpacing/>
+        <w:rPr>
+          <w:rFonts w:cstheme="minorHAnsi"/>
+        </w:rPr>
+      </w:pPr>
+    </w:p>
+    <w:p>
+      <w:pPr>
+        <w:spacing w:after="0" w:line="240" w:lineRule="auto"/>
+        <w:contextualSpacing/>
+        <w:rPr>
+          <w:rFonts w:cstheme="minorHAnsi"/>
+        </w:rPr>
+      </w:pPr>
+      <w:r>
+        <w:rPr>
+          <w:rFonts w:cstheme="minorHAnsi"/>
+        </w:rPr>
+        <w:t>The above input impedance shows</w:t>
+      </w:r>
+      <w:r>
+        <w:rPr>
+          <w:rFonts w:cstheme="minorHAnsi"/>
+        </w:rPr>
+        <w:t xml:space="preserve"> that the ferrite bead in combination with the ceramic capacitors cause a huge spike in input impedance that will attenuate high frequency current pulses from the s</w:t>
+      </w:r>
+      <w:r>
+        <w:rPr>
+          <w:rFonts w:cstheme="minorHAnsi"/>
+        </w:rPr>
+        <w:t>upply</w:t>
+      </w:r>
+      <w:r>
+        <w:rPr>
+          <w:rFonts w:cstheme="minorHAnsi"/>
+        </w:rPr>
+        <w:t xml:space="preserve">. </w:t>
+      </w:r>
+    </w:p>
+    <w:p>
+      <w:pPr>
+        <w:spacing w:after="0" w:line="240" w:lineRule="auto"/>
+        <w:contextualSpacing/>
+        <w:jc w:val="both"/>
+        <w:rPr>
+          <w:rFonts w:cstheme="minorHAnsi"/>
+        </w:rPr>
+      </w:pPr>
+    </w:p>
+    <w:p>
+      <w:pPr>
+        <w:spacing w:after="0" w:line="240" w:lineRule="auto"/>
+        <w:contextualSpacing/>
+        <w:jc w:val="both"/>
+        <w:rPr>
+          <w:rFonts w:cstheme="minorHAnsi"/>
+        </w:rPr>
+      </w:pPr>
+      <w:r>
+        <w:rPr>
+          <w:rFonts w:cstheme="minorHAnsi"/>
+        </w:rPr>
+        <w:t xml:space="preserve">And the overall frequency response from input -&gt; output of the filter: </w:t>
+      </w:r>
+    </w:p>
+    <w:p>
+      <w:pPr>
+        <w:spacing w:after="0" w:line="240" w:lineRule="auto"/>
+        <w:contextualSpacing/>
+        <w:jc w:val="both"/>
+        <w:rPr>
+          <w:rFonts w:cstheme="minorHAnsi"/>
+        </w:rPr>
+      </w:pPr>
+    </w:p>
+    <w:p>
+      <w:pPr>
+        <w:spacing w:after="0" w:line="240" w:lineRule="auto"/>
+        <w:contextualSpacing/>
+        <w:jc w:val="center"/>
+        <w:rPr>
+          <w:rFonts w:cstheme="minorHAnsi"/>
+        </w:rPr>
+      </w:pPr>
+      <w:r>
+        <w:rPr>
+          <w:rFonts w:cstheme="minorHAnsi"/>
+          <w:noProof/>
+        </w:rPr>
+        <w:drawing>
+          <wp:inline distT="0" distB="0" distL="0" distR="0" wp14:anchorId="1D5D1152" wp14:editId="0CD9C9CF">
+            <wp:extent cx="4609475" cy="2795182"/>
+            <wp:effectExtent l="0" t="0" r="635" b="5715"/>
+            <wp:docPr id="1870428930" name="Picture 1" descr="A graph of a graph&#10;&#10;AI-generated content may be incorrect."/>
+            <wp:cNvGraphicFramePr>
+              <a:graphicFrameLocks xmlns:a="http://schemas.openxmlformats.org/drawingml/2006/main" noChangeAspect="1"/>
+            </wp:cNvGraphicFramePr>
+            <a:graphic xmlns:a="http://schemas.openxmlformats.org/drawingml/2006/main">
+              <a:graphicData uri="http://schemas.openxmlformats.org/drawingml/2006/picture">
+                <pic:pic xmlns:pic="http://schemas.openxmlformats.org/drawingml/2006/picture">
+                  <pic:nvPicPr>
+                    <pic:cNvPr id="1870428930" name="Picture 1" descr="A graph of a graph&#10;&#10;AI-generated content may be incorrect."/>
+                    <pic:cNvPicPr/>
+                  </pic:nvPicPr>
+                  <pic:blipFill>
+                    <a:blip r:embed="rId27"/>
+                    <a:stretch>
+                      <a:fillRect/>
+                    </a:stretch>
+                  </pic:blipFill>
+                  <pic:spPr>
+                    <a:xfrm>
+                      <a:off x="0" y="0"/>
+                      <a:ext cx="4629707" cy="2807450"/>
+                    </a:xfrm>
+                    <a:prstGeom prst="rect">
+                      <a:avLst/>
+                    </a:prstGeom>
+                  </pic:spPr>
+                </pic:pic>
+              </a:graphicData>
+            </a:graphic>
+          </wp:inline>
+        </w:drawing>
+      </w:r>
+    </w:p>
+    <w:p>
+      <w:pPr>
+        <w:spacing w:after="0" w:line="240" w:lineRule="auto"/>
+        <w:contextualSpacing/>
+        <w:jc w:val="center"/>
+        <w:rPr>
+          <w:rFonts w:cstheme="minorHAnsi"/>
+        </w:rPr>
+      </w:pPr>
+    </w:p>
+    <w:p>
+      <w:pPr>
+        <w:spacing w:after="0" w:line="240" w:lineRule="auto"/>
+        <w:contextualSpacing/>
+        <w:jc w:val="both"/>
         <w:rPr>
           <w:rFonts w:cstheme="minorHAnsi"/>
         </w:rPr>
@@ -2722,7 +3231,7 @@
                 <wp:cNvGraphicFramePr/>
                 <a:graphic xmlns:a="http://schemas.openxmlformats.org/drawingml/2006/main">
                   <a:graphicData uri="http://schemas.microsoft.com/office/word/2010/wordprocessingInk">
-                    <w14:contentPart bwMode="auto" r:id="rId24">
+                    <w14:contentPart bwMode="auto" r:id="rId28">
                       <w14:nvContentPartPr>
                         <w14:cNvContentPartPr/>
                       </w14:nvContentPartPr>
@@ -4439,12 +4948,177 @@
     </w:p>
     <w:p>
       <w:pPr>
+        <w:pStyle w:val="Heading4"/>
+      </w:pPr>
+      <w:r>
+        <w:lastRenderedPageBreak/>
+        <w:t xml:space="preserve">Finalized Control Loop </w:t>
+      </w:r>
+    </w:p>
+    <w:p>
+      <w:pPr>
         <w:tabs>
           <w:tab w:val="left" w:pos="2006"/>
         </w:tabs>
         <w:spacing w:after="0" w:line="240" w:lineRule="auto"/>
         <w:contextualSpacing/>
       </w:pPr>
+    </w:p>
+    <w:p>
+      <w:pPr>
+        <w:tabs>
+          <w:tab w:val="left" w:pos="2006"/>
+        </w:tabs>
+        <w:spacing w:after="0" w:line="240" w:lineRule="auto"/>
+        <w:contextualSpacing/>
+      </w:pPr>
+      <w:r>
+        <w:t>The below finalized schematic snippet shows the slower current servo feedback loop. If V</w:t>
+      </w:r>
+      <w:r>
+        <w:rPr>
+          <w:vertAlign w:val="subscript"/>
+        </w:rPr>
+        <w:t>SET</w:t>
+      </w:r>
+      <w:r>
+        <w:t xml:space="preserve"> is greater than V</w:t>
+      </w:r>
+      <w:r>
+        <w:rPr>
+          <w:vertAlign w:val="subscript"/>
+        </w:rPr>
+        <w:t>SENSE</w:t>
+      </w:r>
+      <w:r>
+        <w:t>, then the inverting integrator will slowly start increasing V</w:t>
+      </w:r>
+      <w:r>
+        <w:rPr>
+          <w:vertAlign w:val="subscript"/>
+        </w:rPr>
+        <w:t>CTRL</w:t>
+      </w:r>
+      <w:r>
+        <w:t>. An increase in V</w:t>
+      </w:r>
+      <w:r>
+        <w:rPr>
+          <w:vertAlign w:val="subscript"/>
+        </w:rPr>
+        <w:t>CTRL</w:t>
+      </w:r>
+      <w:r>
+        <w:t xml:space="preserve"> will result in Q2 pulling the buck feedback voltage down. The much faster responding buck voltage control loop will then increase Vout which will result in a corresponding increase in LED current and thus an increase in V</w:t>
+      </w:r>
+      <w:r>
+        <w:rPr>
+          <w:vertAlign w:val="subscript"/>
+        </w:rPr>
+        <w:t>SENSE</w:t>
+      </w:r>
+      <w:r>
+        <w:t>. V</w:t>
+      </w:r>
+      <w:r>
+        <w:rPr>
+          <w:vertAlign w:val="subscript"/>
+        </w:rPr>
+        <w:t>CTRL</w:t>
+      </w:r>
+      <w:r>
+        <w:t xml:space="preserve"> will continue to rise until V</w:t>
+      </w:r>
+      <w:r>
+        <w:rPr>
+          <w:vertAlign w:val="subscript"/>
+        </w:rPr>
+        <w:t>SENSE</w:t>
+      </w:r>
+      <w:r>
+        <w:t xml:space="preserve"> equals V</w:t>
+      </w:r>
+      <w:r>
+        <w:rPr>
+          <w:vertAlign w:val="subscript"/>
+        </w:rPr>
+        <w:t>SET</w:t>
+      </w:r>
+      <w:r>
+        <w:t xml:space="preserve"> at which point the integrator will maintain V</w:t>
+      </w:r>
+      <w:r>
+        <w:rPr>
+          <w:vertAlign w:val="subscript"/>
+        </w:rPr>
+        <w:t>CTRL</w:t>
+      </w:r>
+      <w:r>
+        <w:t xml:space="preserve"> and </w:t>
+      </w:r>
+      <w:proofErr w:type="gramStart"/>
+      <w:r>
+        <w:t>keep ‘steering’</w:t>
+      </w:r>
+      <w:proofErr w:type="gramEnd"/>
+      <w:r>
+        <w:t xml:space="preserve"> the LED current back to the setpoint if it deviates. </w:t>
+      </w:r>
+    </w:p>
+    <w:p>
+      <w:pPr>
+        <w:tabs>
+          <w:tab w:val="left" w:pos="2006"/>
+        </w:tabs>
+        <w:spacing w:after="0" w:line="240" w:lineRule="auto"/>
+        <w:contextualSpacing/>
+      </w:pPr>
+    </w:p>
+    <w:p>
+      <w:pPr>
+        <w:tabs>
+          <w:tab w:val="left" w:pos="2006"/>
+        </w:tabs>
+        <w:spacing w:after="0" w:line="240" w:lineRule="auto"/>
+        <w:contextualSpacing/>
+      </w:pPr>
+      <w:r>
+        <w:drawing>
+          <wp:inline distT="0" distB="0" distL="0" distR="0" wp14:anchorId="1847338B" wp14:editId="3437A00D">
+            <wp:extent cx="7105015" cy="5920740"/>
+            <wp:effectExtent l="0" t="0" r="635" b="3810"/>
+            <wp:docPr id="2103772191" name="Picture 1" descr="A diagram of a circuit&#10;&#10;AI-generated content may be incorrect."/>
+            <wp:cNvGraphicFramePr>
+              <a:graphicFrameLocks xmlns:a="http://schemas.openxmlformats.org/drawingml/2006/main" noChangeAspect="1"/>
+            </wp:cNvGraphicFramePr>
+            <a:graphic xmlns:a="http://schemas.openxmlformats.org/drawingml/2006/main">
+              <a:graphicData uri="http://schemas.openxmlformats.org/drawingml/2006/picture">
+                <pic:pic xmlns:pic="http://schemas.openxmlformats.org/drawingml/2006/picture">
+                  <pic:nvPicPr>
+                    <pic:cNvPr id="2103772191" name="Picture 1" descr="A diagram of a circuit&#10;&#10;AI-generated content may be incorrect."/>
+                    <pic:cNvPicPr/>
+                  </pic:nvPicPr>
+                  <pic:blipFill>
+                    <a:blip r:embed="rId135"/>
+                    <a:stretch>
+                      <a:fillRect/>
+                    </a:stretch>
+                  </pic:blipFill>
+                  <pic:spPr>
+                    <a:xfrm>
+                      <a:off x="0" y="0"/>
+                      <a:ext cx="7105015" cy="5920740"/>
+                    </a:xfrm>
+                    <a:prstGeom prst="rect">
+                      <a:avLst/>
+                    </a:prstGeom>
+                  </pic:spPr>
+                </pic:pic>
+              </a:graphicData>
+            </a:graphic>
+          </wp:inline>
+        </w:drawing>
+      </w:r>
     </w:p>
     <w:sectPr>
       <w:pgSz w:w="12240" w:h="15840"/>
@@ -8023,7 +8697,7 @@
   </inkml:definitions>
   <inkml:trace contextRef="#ctx0" brushRef="#br0">7 368 1816 0 0,'-6'6'14427'0'0,"6"-2"-10681"0"0,48-3 729 0 0,179-21-949 0 0,9 0-2153 0 0,-3 18-6026 0 0,-196 1-2079 0 0,-16-4-4794 0 0</inkml:trace>
   <inkml:trace contextRef="#ctx0" brushRef="#br0" timeOffset="540.91">679 235 1700 0 0,'-13'-3'5734'0'0,"-12"0"-65"0"0,11 4 610 0 0,14-1-6224 0 0,-1 1 0 0 0,1-1 0 0 0,0 0-1 0 0,-1 1 1 0 0,1-1 0 0 0,0 0-1 0 0,0 0 1 0 0,0 1 0 0 0,-1-1 0 0 0,1 0-1 0 0,0 1 1 0 0,0-1 0 0 0,0 1-1 0 0,0-1 1 0 0,0 0 0 0 0,-1 1 0 0 0,1-1-1 0 0,0 0 1 0 0,0 1 0 0 0,0-1-1 0 0,0 1 1 0 0,0-1 0 0 0,0 0 0 0 0,0 1-1 0 0,1-1 1 0 0,-1 1 0 0 0,0-1-1 0 0,0 0 1 0 0,0 1 0 0 0,0-1 0 0 0,0 0-1 0 0,0 1 1 0 0,1-1 0 0 0,-1 0-1 0 0,0 1 1 0 0,0-1 0 0 0,1 0 0 0 0,-1 1-1 0 0,0-1 1 0 0,0 0 0 0 0,1 0-1 0 0,-1 1 1 0 0,0-1 0 0 0,1 0 0 0 0,-1 0-1 0 0,0 0 1 0 0,1 1 0 0 0,12 13 977 0 0,5-1-725 0 0,0-1 0 0 0,1-1-1 0 0,23 10 1 0 0,-22-11-327 0 0,0 0-1 0 0,27 20 1 0 0,-46-29 36 0 0,0 0 0 0 0,0 0 0 0 0,-1 0 1 0 0,1 0-1 0 0,0 0 0 0 0,0 0 0 0 0,0 0 0 0 0,-1 0 0 0 0,1 1 1 0 0,-1-1-1 0 0,1 0 0 0 0,-1 1 0 0 0,1-1 0 0 0,-1 0 1 0 0,0 1-1 0 0,0-1 0 0 0,1 0 0 0 0,-1 1 0 0 0,0-1 0 0 0,0 1 1 0 0,0-1-1 0 0,-1 0 0 0 0,1 1 0 0 0,0-1 0 0 0,-1 0 0 0 0,1 1 1 0 0,0-1-1 0 0,-1 0 0 0 0,1 1 0 0 0,-1-1 0 0 0,0 0 1 0 0,0 0-1 0 0,1 0 0 0 0,-1 0 0 0 0,0 1 0 0 0,0-1 0 0 0,-2 1 1 0 0,-37 37 547 0 0,-33 14-786 0 0,42-31-4249 0 0,29-21 2397 0 0</inkml:trace>
-  <inkml:trace contextRef="#ctx0" brushRef="#br0" timeOffset="1292.64">1157 261 464 0 0,'0'0'4495'0'0,"-38"2"4211"0"0,32 2-8349 0 0,1 0 0 0 0,-1 0 0 0 0,1 0 0 0 0,0 0 0 0 0,1 1 0 0 0,-1 0 0 0 0,1 0 0 0 0,0 0 0 0 0,0 1 0 0 0,0-1 0 0 0,1 1 0 0 0,0 0 1 0 0,0 0-1 0 0,0 0 0 0 0,1 0 0 0 0,-3 12 0 0 0,4-16-305 0 0,0 1 1 0 0,1 0-1 0 0,-1-1 1 0 0,1 1-1 0 0,-1 0 1 0 0,1 0-1 0 0,0-1 1 0 0,0 1 0 0 0,0 0-1 0 0,1-1 1 0 0,-1 1-1 0 0,0 0 1 0 0,1 0-1 0 0,0-1 1 0 0,0 1-1 0 0,0-1 1 0 0,0 1-1 0 0,0-1 1 0 0,0 1-1 0 0,1-1 1 0 0,-1 0-1 0 0,1 1 1 0 0,-1-1-1 0 0,1 0 1 0 0,0 0-1 0 0,0 0 1 0 0,0-1-1 0 0,0 1 1 0 0,0 0 0 0 0,1-1-1 0 0,-1 1 1 0 0,0-1-1 0 0,1 0 1 0 0,-1 0-1 0 0,1 0 1 0 0,-1 0-1 0 0,1 0 1 0 0,0 0-1 0 0,-1-1 1 0 0,1 1-1 0 0,0-1 1 0 0,2 0-1 0 0,0 1-73 0 0,-1-1-1 0 0,0 0 1 0 0,1-1-1 0 0,-1 1 1 0 0,0-1-1 0 0,0 0 1 0 0,1 0-1 0 0,-1 0 1 0 0,0 0-1 0 0,0-1 0 0 0,0 1 1 0 0,0-1-1 0 0,0 0 1 0 0,-1-1-1 0 0,1 1 1 0 0,-1-1-1 0 0,1 1 1 0 0,-1-1-1 0 0,0 0 1 0 0,0 0-1 0 0,0 0 1 0 0,0-1-1 0 0,-1 1 1 0 0,1-1-1 0 0,-1 0 1 0 0,0 1-1 0 0,0-1 0 0 0,0 0 1 0 0,-1 0-1 0 0,0 0 1 0 0,2-5-1 0 0,-2 4-44 0 0,1 0 0 0 0,-1 1 1 0 0,0-1-1 0 0,0 0 0 0 0,-1 0 0 0 0,1 0 0 0 0,-1 0 0 0 0,0 0 0 0 0,0 0 0 0 0,-1 0 0 0 0,0 0 0 0 0,0 0 0 0 0,0 0 0 0 0,0 1 0 0 0,-1-1 0 0 0,1 0 0 0 0,-1 1 0 0 0,-1-1 0 0 0,1 1 0 0 0,-1 0 1 0 0,1-1-1 0 0,-1 1 0 0 0,0 0 0 0 0,-1 1 0 0 0,-6-8 0 0 0,8 10-14 0 0,1 1-1 0 0,-1-1 1 0 0,0 0 0 0 0,0 0 0 0 0,1 1-1 0 0,-1-1 1 0 0,0 1 0 0 0,0 0 0 0 0,0-1 0 0 0,0 1-1 0 0,1 0 1 0 0,-1 0 0 0 0,0 0 0 0 0,0 0 0 0 0,0 0-1 0 0,0 1 1 0 0,0-1 0 0 0,1 1 0 0 0,-1-1-1 0 0,0 1 1 0 0,0 0 0 0 0,1-1 0 0 0,-1 1 0 0 0,0 0-1 0 0,1 0 1 0 0,-1 0 0 0 0,1 0 0 0 0,-1 1 0 0 0,1-1-1 0 0,-1 0 1 0 0,1 0 0 0 0,0 1 0 0 0,0-1-1 0 0,-2 3 1 0 0,2-2-1166 0 0,2 1-1014 0 0,-1 3 1120 0 0,13 1-8592 0 0</inkml:trace>
+  <inkml:trace contextRef="#ctx0" brushRef="#br0" timeOffset="1292.6">1157 261 464 0 0,'0'0'4495'0'0,"-38"2"4211"0"0,32 2-8349 0 0,1 0 0 0 0,-1 0 0 0 0,1 0 0 0 0,0 0 0 0 0,1 1 0 0 0,-1 0 0 0 0,1 0 0 0 0,0 0 0 0 0,0 1 0 0 0,0-1 0 0 0,1 1 0 0 0,0 0 1 0 0,0 0-1 0 0,0 0 0 0 0,1 0 0 0 0,-3 12 0 0 0,4-16-305 0 0,0 1 1 0 0,1 0-1 0 0,-1-1 1 0 0,1 1-1 0 0,-1 0 1 0 0,1 0-1 0 0,0-1 1 0 0,0 1 0 0 0,0 0-1 0 0,1-1 1 0 0,-1 1-1 0 0,0 0 1 0 0,1 0-1 0 0,0-1 1 0 0,0 1-1 0 0,0-1 1 0 0,0 1-1 0 0,0-1 1 0 0,0 1-1 0 0,1-1 1 0 0,-1 0-1 0 0,1 1 1 0 0,-1-1-1 0 0,1 0 1 0 0,0 0-1 0 0,0 0 1 0 0,0-1-1 0 0,0 1 1 0 0,0 0 0 0 0,1-1-1 0 0,-1 1 1 0 0,0-1-1 0 0,1 0 1 0 0,-1 0-1 0 0,1 0 1 0 0,-1 0-1 0 0,1 0 1 0 0,0 0-1 0 0,-1-1 1 0 0,1 1-1 0 0,0-1 1 0 0,2 0-1 0 0,0 1-73 0 0,-1-1-1 0 0,0 0 1 0 0,1-1-1 0 0,-1 1 1 0 0,0-1-1 0 0,0 0 1 0 0,1 0-1 0 0,-1 0 1 0 0,0 0-1 0 0,0-1 0 0 0,0 1 1 0 0,0-1-1 0 0,0 0 1 0 0,-1-1-1 0 0,1 1 1 0 0,-1-1-1 0 0,1 1 1 0 0,-1-1-1 0 0,0 0 1 0 0,0 0-1 0 0,0 0 1 0 0,0-1-1 0 0,-1 1 1 0 0,1-1-1 0 0,-1 0 1 0 0,0 1-1 0 0,0-1 0 0 0,0 0 1 0 0,-1 0-1 0 0,0 0 1 0 0,2-5-1 0 0,-2 4-44 0 0,1 0 0 0 0,-1 1 1 0 0,0-1-1 0 0,0 0 0 0 0,-1 0 0 0 0,1 0 0 0 0,-1 0 0 0 0,0 0 0 0 0,0 0 0 0 0,-1 0 0 0 0,0 0 0 0 0,0 0 0 0 0,0 0 0 0 0,0 1 0 0 0,-1-1 0 0 0,1 0 0 0 0,-1 1 0 0 0,-1-1 0 0 0,1 1 0 0 0,-1 0 1 0 0,1-1-1 0 0,-1 1 0 0 0,0 0 0 0 0,-1 1 0 0 0,-6-8 0 0 0,8 10-14 0 0,1 1-1 0 0,-1-1 1 0 0,0 0 0 0 0,0 0 0 0 0,1 1-1 0 0,-1-1 1 0 0,0 1 0 0 0,0 0 0 0 0,0-1 0 0 0,0 1-1 0 0,1 0 1 0 0,-1 0 0 0 0,0 0 0 0 0,0 0 0 0 0,0 0-1 0 0,0 1 1 0 0,0-1 0 0 0,1 1 0 0 0,-1-1-1 0 0,0 1 1 0 0,0 0 0 0 0,1-1 0 0 0,-1 1 0 0 0,0 0-1 0 0,1 0 1 0 0,-1 0 0 0 0,1 0 0 0 0,-1 1 0 0 0,1-1-1 0 0,-1 0 1 0 0,1 0 0 0 0,0 1 0 0 0,0-1-1 0 0,-2 3 1 0 0,2-2-1166 0 0,2 1-1014 0 0,-1 3 1120 0 0,13 1-8592 0 0</inkml:trace>
   <inkml:trace contextRef="#ctx0" brushRef="#br0" timeOffset="1600.42">1479 54 2128 0 0,'-49'-12'10787'0'0,"46"12"-10552"0"0,-1 1 0 0 0,1-1 0 0 0,0 1 1 0 0,0 0-1 0 0,-1 0 0 0 0,1 0 0 0 0,0 0 0 0 0,0 1 0 0 0,0-1 0 0 0,0 1 0 0 0,0 0 0 0 0,1 0 0 0 0,-1 0 0 0 0,0 0 1 0 0,1 0-1 0 0,0 0 0 0 0,-1 1 0 0 0,1-1 0 0 0,0 1 0 0 0,0 0 0 0 0,0-1 0 0 0,1 1 0 0 0,-1 0 0 0 0,1 0 0 0 0,0 0 1 0 0,-1 0-1 0 0,1 1 0 0 0,0-1 0 0 0,1 0 0 0 0,-1 0 0 0 0,1 1 0 0 0,-1-1 0 0 0,1 7 0 0 0,0 12 129 0 0,1 0 0 0 0,1 0-1 0 0,1 0 1 0 0,6 26 0 0 0,-1-6-508 0 0,-6-32-329 0 0,-1 1-1 0 0,-1-1 0 0 0,0 1 0 0 0,-2 20 0 0 0,-4-9-3194 0 0,-5-2-3831 0 0,8-18 4354 0 0,-5 3-353 0 0</inkml:trace>
   <inkml:trace contextRef="#ctx0" brushRef="#br0" timeOffset="1788.82">1278 316 2164 0 0,'0'-1'369'0'0,"0"0"0"0"0,0 0 0 0 0,0 0 0 0 0,0 0 1 0 0,0 0-1 0 0,0 0 0 0 0,0 0 0 0 0,0 0 0 0 0,0 0 0 0 0,0 0 0 0 0,1 0 0 0 0,-1 0 0 0 0,0 0 0 0 0,1 0 0 0 0,-1 0 0 0 0,1 0 0 0 0,-1 0 0 0 0,1 0 1 0 0,-1 0-1 0 0,1 0 0 0 0,0 0 0 0 0,1 0 0 0 0,25-15 2875 0 0,49 3-5297 0 0,-51 9 470 0 0,23-7-4627 0 0,-33 7 4563 0 0</inkml:trace>
   <inkml:trace contextRef="#ctx0" brushRef="#br0" timeOffset="2063.51">1686 73 2264 0 0,'-1'-2'462'0'0,"0"0"-1"0"0,0 1 1 0 0,0-1-1 0 0,0 0 1 0 0,-1 1-1 0 0,1-1 0 0 0,-1 1 1 0 0,1 0-1 0 0,-1-1 1 0 0,1 1-1 0 0,-1 0 1 0 0,0 0-1 0 0,1 0 1 0 0,-1 0-1 0 0,0 0 1 0 0,0 0-1 0 0,0 1 1 0 0,0-1-1 0 0,1 1 0 0 0,-1-1 1 0 0,0 1-1 0 0,0 0 1 0 0,0-1-1 0 0,0 1 1 0 0,0 0-1 0 0,0 1 1 0 0,0-1-1 0 0,-3 0 1 0 0,2 2-233 0 0,1-1 1 0 0,0 1 0 0 0,-1-1 0 0 0,1 1 0 0 0,0 0 0 0 0,0 0 0 0 0,0 0 0 0 0,0 0-1 0 0,0 0 1 0 0,1 0 0 0 0,-1 0 0 0 0,1 1 0 0 0,-1-1 0 0 0,1 1 0 0 0,0-1 0 0 0,0 1-1 0 0,0-1 1 0 0,0 1 0 0 0,0 0 0 0 0,0 3 0 0 0,-3 15 249 0 0,2 0 0 0 0,0 0 0 0 0,1 1-1 0 0,1-1 1 0 0,5 34 0 0 0,-1 0-2518 0 0,-5-1-4012 0 0</inkml:trace>

</xml_diff>